<commit_message>
Week 5: record manual Heuristic test (Activity 4), update repo link
</commit_message>
<xml_diff>
--- a/docs/week05/Hafta05_ML-Agents_Rapor.docx
+++ b/docs/week05/Hafta05_ML-Agents_Rapor.docx
@@ -224,12 +224,12 @@
         </w:rPr>
         <w:t xml:space="preserve">GitHub deposu: </w:t>
       </w:r>
-      <w:hyperlink w:history="1" r:id="rIdibonrvln4-2vzmyj0ybef">
+      <w:hyperlink w:history="1" r:id="rIdovovv2x1o0qwahtfehfph">
         <w:r>
           <w:rPr>
             <w:rStyle w:val="Hyperlink"/>
           </w:rPr>
-          <w:t xml:space="preserve">https://github.com/Veyselugurlu/BLM5026-Oyunlarda-Yapay-Zeka</w:t>
+          <w:t xml:space="preserve">https://github.com/Veyselugurlu/BLM5026-Bilgisayar-Oyunlarinda-Yapay-Zeka</w:t>
         </w:r>
       </w:hyperlink>
     </w:p>
@@ -244,7 +244,7 @@
         </w:rPr>
         <w:t xml:space="preserve">Bu haftanın dalı: </w:t>
       </w:r>
-      <w:hyperlink w:history="1" r:id="rIdqfb8hqta-7uv16fan9yul">
+      <w:hyperlink w:history="1" r:id="rIdcwo6kjcllixqfr-ae2qxr">
         <w:r>
           <w:rPr>
             <w:rStyle w:val="Hyperlink"/>
@@ -4897,6 +4897,21 @@
         <w:spacing w:after="120" w:line="300"/>
       </w:pPr>
       <w:r>
+        <w:rPr>
+          <w:b/>
+          <w:bCs/>
+        </w:rPr>
+        <w:t xml:space="preserve">Manuel test sonucu (Aktivite 4): </w:t>
+      </w:r>
+      <w:r>
+        <w:t xml:space="preserve">Unity Editor'da Behavior Type = Heuristic Only yapılarak top WASD ile sürüldü. Üç senaryo da beklendiği gibi çalıştı: (1) top tuşlarla hareket ediyor; (2) hedefe değince episode bitiyor, top merkeze dönüyor ve hedef yeni bir yere taşınıyor; (3) zeminden düşünce episode bitiyor ve top merkeze dönüyor.</w:t>
+      </w:r>
+    </w:p>
+    <w:p>
+      <w:pPr>
+        <w:spacing w:after="120" w:line="300"/>
+      </w:pPr>
+      <w:r>
         <w:t xml:space="preserve">Ortam mantığı ayrıca otomatik olarak da test edilmiştir. Hedefe doğru iten basit bir kural tabanlı kontrolcü 200 denemenin tamamında hedefe ulaşmıştır; bu, başarı kontrolünün ve episode sıfırlamanın çalıştığını gösterir. Rastgele hareket eden bir politika ise denemelerin çoğunda zeminden düşmüştür; bu da düşme kontrolünün ve sıfırlamanın çalıştığını gösterir.</w:t>
       </w:r>
     </w:p>
@@ -10221,12 +10236,12 @@
         </w:rPr>
         <w:t xml:space="preserve">Depo: </w:t>
       </w:r>
-      <w:hyperlink w:history="1" r:id="rIdemhr1s7lgfpgxq6t-6ccx">
+      <w:hyperlink w:history="1" r:id="rIdmyc-iwptv71ovf5ne9lpo">
         <w:r>
           <w:rPr>
             <w:rStyle w:val="Hyperlink"/>
           </w:rPr>
-          <w:t xml:space="preserve">https://github.com/Veyselugurlu/BLM5026-Oyunlarda-Yapay-Zeka</w:t>
+          <w:t xml:space="preserve">https://github.com/Veyselugurlu/BLM5026-Bilgisayar-Oyunlarinda-Yapay-Zeka</w:t>
         </w:r>
       </w:hyperlink>
     </w:p>
@@ -10443,7 +10458,7 @@
       <w:r>
         <w:t xml:space="preserve">Unity Technologies, Unity ML-Agents Toolkit, GitHub deposu, </w:t>
       </w:r>
-      <w:hyperlink w:history="1" r:id="rIdspuqmr2sz9hgdopdlgdap">
+      <w:hyperlink w:history="1" r:id="rIdna9iwvlx7qndjcqfocvi2">
         <w:r>
           <w:rPr>
             <w:rStyle w:val="Hyperlink"/>

</xml_diff>